<commit_message>
sostenibilidad y tarea sge
</commit_message>
<xml_diff>
--- a/Sostenibilidad/Ev2/EjerciciosSostenibilidadTema2.docx
+++ b/Sostenibilidad/Ev2/EjerciciosSostenibilidadTema2.docx
@@ -422,6 +422,358 @@
           <w:rFonts w:cstheme="minorHAnsi"/>
         </w:rPr>
         <w:t>· Desertización: transformación en desierto por causas naturales (clima, falta de lluvias).</w:t>
+      </w:r>
+    </w:p>
+    <w:p>
+      <w:pPr>
+        <w:pStyle w:val="whitespace-normal"/>
+        <w:rPr>
+          <w:rFonts w:cstheme="minorHAnsi"/>
+        </w:rPr>
+      </w:pPr>
+    </w:p>
+    <w:p>
+      <w:pPr>
+        <w:pStyle w:val="whitespace-normal"/>
+        <w:numPr>
+          <w:ilvl w:val="0"/>
+          <w:numId w:val="1"/>
+        </w:numPr>
+        <w:rPr>
+          <w:rFonts w:cstheme="minorHAnsi"/>
+        </w:rPr>
+      </w:pPr>
+      <w:r>
+        <w:rPr>
+          <w:rFonts w:cstheme="minorHAnsi"/>
+        </w:rPr>
+        <w:t>2.5 Localiza y nombra las provincias que se encuentran en el cuadrante sudoriental de España.</w:t>
+      </w:r>
+    </w:p>
+    <w:p>
+      <w:pPr>
+        <w:pStyle w:val="whitespace-normal"/>
+        <w:rPr>
+          <w:rFonts w:cstheme="minorHAnsi"/>
+        </w:rPr>
+      </w:pPr>
+      <w:r>
+        <w:rPr>
+          <w:rFonts w:cstheme="minorHAnsi"/>
+        </w:rPr>
+        <w:t>El cuadrante sudoriental de España está formado por las provincias de Almería, Granada y Málaga, en Andalucía, Murcia, en la Región de Murcia, y Alicante, en la Comunidad Valenciana, situadas en el sureste de la península y con predominio del clima mediterráneo.</w:t>
+      </w:r>
+    </w:p>
+    <w:p>
+      <w:pPr>
+        <w:pStyle w:val="whitespace-normal"/>
+        <w:rPr>
+          <w:rFonts w:cstheme="minorHAnsi"/>
+        </w:rPr>
+      </w:pPr>
+    </w:p>
+    <w:p>
+      <w:pPr>
+        <w:pStyle w:val="whitespace-normal"/>
+        <w:numPr>
+          <w:ilvl w:val="0"/>
+          <w:numId w:val="1"/>
+        </w:numPr>
+        <w:rPr>
+          <w:rFonts w:cstheme="minorHAnsi"/>
+        </w:rPr>
+      </w:pPr>
+      <w:r>
+        <w:rPr>
+          <w:rFonts w:cstheme="minorHAnsi"/>
+        </w:rPr>
+        <w:lastRenderedPageBreak/>
+        <w:t>2.6</w:t>
+      </w:r>
+      <w:r>
+        <w:rPr>
+          <w:rFonts w:cstheme="minorHAnsi"/>
+        </w:rPr>
+        <w:t xml:space="preserve"> Consulta el listado de especies invasoras en España, disponible en el enlace: </w:t>
+      </w:r>
+      <w:r>
+        <w:rPr>
+          <w:rFonts w:cstheme="minorHAnsi"/>
+        </w:rPr>
+        <w:t>https</w:t>
+      </w:r>
+      <w:proofErr w:type="gramStart"/>
+      <w:r>
+        <w:rPr>
+          <w:rFonts w:cstheme="minorHAnsi"/>
+        </w:rPr>
+        <w:t>:/</w:t>
+      </w:r>
+      <w:proofErr w:type="gramEnd"/>
+      <w:r>
+        <w:rPr>
+          <w:rFonts w:cstheme="minorHAnsi"/>
+        </w:rPr>
+        <w:t>/www.miteco.gob.es/es/biodiversidad/temas/conservacion-de-especies.html</w:t>
+      </w:r>
+      <w:r>
+        <w:rPr>
+          <w:rFonts w:cstheme="minorHAnsi"/>
+        </w:rPr>
+        <w:t>, y elabora un pequeño resumen.</w:t>
+      </w:r>
+    </w:p>
+    <w:p>
+      <w:pPr>
+        <w:rPr>
+          <w:rFonts w:cstheme="minorHAnsi"/>
+        </w:rPr>
+      </w:pPr>
+      <w:r>
+        <w:rPr>
+          <w:rFonts w:cstheme="minorHAnsi"/>
+        </w:rPr>
+        <w:t>En España existe un listado oficial de especies invasoras, que incluye animales y plantas que no son nativos y que causan problemas en la naturaleza, la economía o la salud. Estas especies están reguladas por ley, por lo que está prohibido introducirlas, transportarlas o venderlas, y se deben controlar si aparecen en el medio natural. El listado se actualiza constantemente según nuevos estudios y descubrimientos.</w:t>
+      </w:r>
+      <w:r>
+        <w:rPr>
+          <w:rFonts w:cstheme="minorHAnsi"/>
+        </w:rPr>
+        <w:br/>
+      </w:r>
+      <w:r>
+        <w:rPr>
+          <w:rFonts w:cstheme="minorHAnsi"/>
+        </w:rPr>
+        <w:br/>
+      </w:r>
+      <w:r>
+        <w:rPr>
+          <w:rFonts w:cstheme="minorHAnsi"/>
+        </w:rPr>
+        <w:t>Entre las especies invasoras más comunes se encuentran peces pequeños introducidos para el control de mosquitos, cangrejos que dañan ríos, plantas acuáticas que cubren lagos y pantanos y otras especies que afectan a animales y plantas locales. Todas ellas alteran los ecosistemas y dificultan la vida de las especies nativas.</w:t>
+      </w:r>
+      <w:r>
+        <w:rPr>
+          <w:rFonts w:cstheme="minorHAnsi"/>
+        </w:rPr>
+        <w:br/>
+      </w:r>
+      <w:r>
+        <w:rPr>
+          <w:rFonts w:cstheme="minorHAnsi"/>
+        </w:rPr>
+        <w:br/>
+      </w:r>
+      <w:r>
+        <w:rPr>
+          <w:rFonts w:cstheme="minorHAnsi"/>
+        </w:rPr>
+        <w:t>Las especies invasoras son una de las principales amenazas para la biodiversidad en España. Pueden desplazar a los animales y plantas locales, cambiar los hábitats naturales y transmitir enfermedades. Además, afectan a actividades humanas como la agricultura, la pesca y la apicultura, y algunas, como ciertas avispas invasoras, se han expandido muy rápido causando problemas en varias zonas del país.</w:t>
+      </w:r>
+    </w:p>
+    <w:p>
+      <w:pPr>
+        <w:pStyle w:val="whitespace-normal"/>
+        <w:numPr>
+          <w:ilvl w:val="0"/>
+          <w:numId w:val="1"/>
+        </w:numPr>
+        <w:rPr>
+          <w:rFonts w:cstheme="minorHAnsi"/>
+        </w:rPr>
+      </w:pPr>
+      <w:r>
+        <w:rPr>
+          <w:rFonts w:cstheme="minorHAnsi"/>
+        </w:rPr>
+        <w:t>2.7</w:t>
+      </w:r>
+    </w:p>
+    <w:p>
+      <w:pPr>
+        <w:pStyle w:val="whitespace-normal"/>
+        <w:rPr>
+          <w:rFonts w:cstheme="minorHAnsi"/>
+        </w:rPr>
+      </w:pPr>
+    </w:p>
+    <w:p>
+      <w:pPr>
+        <w:pStyle w:val="whitespace-normal"/>
+        <w:numPr>
+          <w:ilvl w:val="0"/>
+          <w:numId w:val="1"/>
+        </w:numPr>
+        <w:rPr>
+          <w:rFonts w:cstheme="minorHAnsi"/>
+        </w:rPr>
+      </w:pPr>
+      <w:r>
+        <w:rPr>
+          <w:rFonts w:cstheme="minorHAnsi"/>
+        </w:rPr>
+        <w:t>2.8</w:t>
+      </w:r>
+    </w:p>
+    <w:p>
+      <w:pPr>
+        <w:pStyle w:val="Prrafodelista"/>
+        <w:rPr>
+          <w:rFonts w:cstheme="minorHAnsi"/>
+        </w:rPr>
+      </w:pPr>
+    </w:p>
+    <w:p>
+      <w:pPr>
+        <w:pStyle w:val="whitespace-normal"/>
+        <w:rPr>
+          <w:rFonts w:cstheme="minorHAnsi"/>
+        </w:rPr>
+      </w:pPr>
+    </w:p>
+    <w:p>
+      <w:pPr>
+        <w:pStyle w:val="whitespace-normal"/>
+        <w:numPr>
+          <w:ilvl w:val="0"/>
+          <w:numId w:val="1"/>
+        </w:numPr>
+        <w:rPr>
+          <w:rFonts w:cstheme="minorHAnsi"/>
+        </w:rPr>
+      </w:pPr>
+      <w:r>
+        <w:rPr>
+          <w:rFonts w:cstheme="minorHAnsi"/>
+        </w:rPr>
+        <w:t>2.9</w:t>
+      </w:r>
+    </w:p>
+    <w:p>
+      <w:pPr>
+        <w:pStyle w:val="whitespace-normal"/>
+        <w:numPr>
+          <w:ilvl w:val="0"/>
+          <w:numId w:val="1"/>
+        </w:numPr>
+        <w:rPr>
+          <w:rFonts w:cstheme="minorHAnsi"/>
+        </w:rPr>
+      </w:pPr>
+      <w:r>
+        <w:rPr>
+          <w:rFonts w:cstheme="minorHAnsi"/>
+        </w:rPr>
+        <w:t>0</w:t>
+      </w:r>
+    </w:p>
+    <w:p>
+      <w:pPr>
+        <w:pStyle w:val="whitespace-normal"/>
+        <w:numPr>
+          <w:ilvl w:val="0"/>
+          <w:numId w:val="1"/>
+        </w:numPr>
+        <w:rPr>
+          <w:rFonts w:cstheme="minorHAnsi"/>
+        </w:rPr>
+      </w:pPr>
+      <w:r>
+        <w:rPr>
+          <w:rFonts w:cstheme="minorHAnsi"/>
+        </w:rPr>
+        <w:t>0</w:t>
+      </w:r>
+    </w:p>
+    <w:p>
+      <w:pPr>
+        <w:pStyle w:val="whitespace-normal"/>
+        <w:numPr>
+          <w:ilvl w:val="0"/>
+          <w:numId w:val="1"/>
+        </w:numPr>
+        <w:rPr>
+          <w:rFonts w:cstheme="minorHAnsi"/>
+        </w:rPr>
+      </w:pPr>
+      <w:r>
+        <w:rPr>
+          <w:rFonts w:cstheme="minorHAnsi"/>
+        </w:rPr>
+        <w:t>0</w:t>
+      </w:r>
+    </w:p>
+    <w:p>
+      <w:pPr>
+        <w:pStyle w:val="whitespace-normal"/>
+        <w:numPr>
+          <w:ilvl w:val="0"/>
+          <w:numId w:val="1"/>
+        </w:numPr>
+        <w:rPr>
+          <w:rFonts w:cstheme="minorHAnsi"/>
+        </w:rPr>
+      </w:pPr>
+      <w:r>
+        <w:rPr>
+          <w:rFonts w:cstheme="minorHAnsi"/>
+        </w:rPr>
+        <w:t>0</w:t>
+      </w:r>
+    </w:p>
+    <w:p>
+      <w:pPr>
+        <w:pStyle w:val="whitespace-normal"/>
+        <w:numPr>
+          <w:ilvl w:val="0"/>
+          <w:numId w:val="1"/>
+        </w:numPr>
+        <w:rPr>
+          <w:rFonts w:cstheme="minorHAnsi"/>
+        </w:rPr>
+      </w:pPr>
+      <w:r>
+        <w:rPr>
+          <w:rFonts w:cstheme="minorHAnsi"/>
+        </w:rPr>
+        <w:t>0</w:t>
+      </w:r>
+    </w:p>
+    <w:p>
+      <w:pPr>
+        <w:pStyle w:val="whitespace-normal"/>
+        <w:numPr>
+          <w:ilvl w:val="0"/>
+          <w:numId w:val="1"/>
+        </w:numPr>
+        <w:rPr>
+          <w:rFonts w:cstheme="minorHAnsi"/>
+        </w:rPr>
+      </w:pPr>
+      <w:r>
+        <w:rPr>
+          <w:rFonts w:cstheme="minorHAnsi"/>
+        </w:rPr>
+        <w:t>0</w:t>
+      </w:r>
+    </w:p>
+    <w:p>
+      <w:pPr>
+        <w:pStyle w:val="whitespace-normal"/>
+        <w:numPr>
+          <w:ilvl w:val="0"/>
+          <w:numId w:val="1"/>
+        </w:numPr>
+        <w:rPr>
+          <w:rFonts w:cstheme="minorHAnsi"/>
+        </w:rPr>
+      </w:pPr>
+      <w:r>
+        <w:rPr>
+          <w:rFonts w:cstheme="minorHAnsi"/>
+        </w:rPr>
+        <w:t>0</w:t>
       </w:r>
     </w:p>
     <w:sectPr>

</xml_diff>

<commit_message>
ejs sostibilidad y documento proyecto
</commit_message>
<xml_diff>
--- a/Sostenibilidad/Ev2/EjerciciosSostenibilidadTema2.docx
+++ b/Sostenibilidad/Ev2/EjerciciosSostenibilidadTema2.docx
@@ -39,10 +39,7 @@
     <w:p>
       <w:pPr>
         <w:pStyle w:val="NormalWeb"/>
-        <w:numPr>
-          <w:ilvl w:val="0"/>
-          <w:numId w:val="1"/>
-        </w:numPr>
+        <w:ind w:left="360"/>
         <w:rPr>
           <w:rFonts w:asciiTheme="minorHAnsi" w:hAnsiTheme="minorHAnsi" w:cstheme="minorHAnsi"/>
           <w:b/>
@@ -54,27 +51,37 @@
           <w:rFonts w:asciiTheme="minorHAnsi" w:eastAsiaTheme="majorEastAsia" w:hAnsiTheme="minorHAnsi" w:cstheme="minorHAnsi"/>
           <w:b w:val="0"/>
         </w:rPr>
+        <w:t>-</w:t>
+      </w:r>
+      <w:r>
+        <w:rPr>
+          <w:rStyle w:val="Textoennegrita"/>
+          <w:rFonts w:asciiTheme="minorHAnsi" w:eastAsiaTheme="majorEastAsia" w:hAnsiTheme="minorHAnsi" w:cstheme="minorHAnsi"/>
+          <w:b w:val="0"/>
+        </w:rPr>
         <w:t xml:space="preserve">Metano </w:t>
       </w:r>
-    </w:p>
-    <w:p>
-      <w:pPr>
-        <w:pStyle w:val="NormalWeb"/>
-        <w:numPr>
-          <w:ilvl w:val="0"/>
-          <w:numId w:val="1"/>
-        </w:numPr>
+      <w:r>
         <w:rPr>
           <w:rFonts w:asciiTheme="minorHAnsi" w:hAnsiTheme="minorHAnsi" w:cstheme="minorHAnsi"/>
           <w:b/>
         </w:rPr>
-      </w:pPr>
+        <w:br/>
+      </w:r>
       <w:r>
         <w:rPr>
           <w:rStyle w:val="Textoennegrita"/>
           <w:rFonts w:asciiTheme="minorHAnsi" w:eastAsiaTheme="majorEastAsia" w:hAnsiTheme="minorHAnsi" w:cstheme="minorHAnsi"/>
           <w:b w:val="0"/>
         </w:rPr>
+        <w:t>-</w:t>
+      </w:r>
+      <w:r>
+        <w:rPr>
+          <w:rStyle w:val="Textoennegrita"/>
+          <w:rFonts w:asciiTheme="minorHAnsi" w:eastAsiaTheme="majorEastAsia" w:hAnsiTheme="minorHAnsi" w:cstheme="minorHAnsi"/>
+          <w:b w:val="0"/>
+        </w:rPr>
         <w:t xml:space="preserve">Óxido nitroso </w:t>
       </w:r>
       <w:r>
@@ -84,19 +91,14 @@
         </w:rPr>
         <w:t xml:space="preserve"> </w:t>
       </w:r>
-    </w:p>
-    <w:p>
-      <w:pPr>
-        <w:pStyle w:val="NormalWeb"/>
-        <w:numPr>
-          <w:ilvl w:val="0"/>
-          <w:numId w:val="1"/>
-        </w:numPr>
+      <w:r>
         <w:rPr>
           <w:rFonts w:asciiTheme="minorHAnsi" w:hAnsiTheme="minorHAnsi" w:cstheme="minorHAnsi"/>
           <w:b/>
         </w:rPr>
-      </w:pPr>
+        <w:br/>
+        <w:t>-</w:t>
+      </w:r>
       <w:r>
         <w:rPr>
           <w:rStyle w:val="Textoennegrita"/>
@@ -112,19 +114,14 @@
         </w:rPr>
         <w:t xml:space="preserve"> </w:t>
       </w:r>
-    </w:p>
-    <w:p>
-      <w:pPr>
-        <w:pStyle w:val="NormalWeb"/>
-        <w:numPr>
-          <w:ilvl w:val="0"/>
-          <w:numId w:val="1"/>
-        </w:numPr>
+      <w:r>
         <w:rPr>
           <w:rFonts w:asciiTheme="minorHAnsi" w:hAnsiTheme="minorHAnsi" w:cstheme="minorHAnsi"/>
           <w:b/>
         </w:rPr>
-      </w:pPr>
+        <w:br/>
+        <w:t>-</w:t>
+      </w:r>
       <w:proofErr w:type="spellStart"/>
       <w:r>
         <w:rPr>
@@ -143,19 +140,14 @@
         </w:rPr>
         <w:t xml:space="preserve"> </w:t>
       </w:r>
-    </w:p>
-    <w:p>
-      <w:pPr>
-        <w:pStyle w:val="NormalWeb"/>
-        <w:numPr>
-          <w:ilvl w:val="0"/>
-          <w:numId w:val="1"/>
-        </w:numPr>
+      <w:r>
         <w:rPr>
           <w:rFonts w:asciiTheme="minorHAnsi" w:hAnsiTheme="minorHAnsi" w:cstheme="minorHAnsi"/>
           <w:b/>
         </w:rPr>
-      </w:pPr>
+        <w:br/>
+        <w:t>-</w:t>
+      </w:r>
       <w:proofErr w:type="spellStart"/>
       <w:r>
         <w:rPr>
@@ -174,19 +166,14 @@
         </w:rPr>
         <w:t xml:space="preserve"> </w:t>
       </w:r>
-    </w:p>
-    <w:p>
-      <w:pPr>
-        <w:pStyle w:val="NormalWeb"/>
-        <w:numPr>
-          <w:ilvl w:val="0"/>
-          <w:numId w:val="1"/>
-        </w:numPr>
+      <w:r>
         <w:rPr>
           <w:rFonts w:asciiTheme="minorHAnsi" w:hAnsiTheme="minorHAnsi" w:cstheme="minorHAnsi"/>
           <w:b/>
         </w:rPr>
-      </w:pPr>
+        <w:br/>
+        <w:t>-</w:t>
+      </w:r>
       <w:proofErr w:type="spellStart"/>
       <w:r>
         <w:rPr>
@@ -205,19 +192,14 @@
         </w:rPr>
         <w:t xml:space="preserve"> </w:t>
       </w:r>
-    </w:p>
-    <w:p>
-      <w:pPr>
-        <w:pStyle w:val="NormalWeb"/>
-        <w:numPr>
-          <w:ilvl w:val="0"/>
-          <w:numId w:val="1"/>
-        </w:numPr>
+      <w:r>
         <w:rPr>
           <w:rFonts w:asciiTheme="minorHAnsi" w:hAnsiTheme="minorHAnsi" w:cstheme="minorHAnsi"/>
           <w:b/>
         </w:rPr>
-      </w:pPr>
+        <w:br/>
+        <w:t>-</w:t>
+      </w:r>
       <w:proofErr w:type="spellStart"/>
       <w:r>
         <w:rPr>
@@ -589,6 +571,12 @@
         </w:rPr>
         <w:t>2.7</w:t>
       </w:r>
+      <w:r>
+        <w:rPr>
+          <w:rFonts w:cstheme="minorHAnsi"/>
+        </w:rPr>
+        <w:t xml:space="preserve"> Indica a qué organización de las Naciones Unidas corresponden las siglas FAO. ¿De qué trata el CITES?</w:t>
+      </w:r>
     </w:p>
     <w:p>
       <w:pPr>
@@ -597,6 +585,34 @@
           <w:rFonts w:cstheme="minorHAnsi"/>
         </w:rPr>
       </w:pPr>
+      <w:proofErr w:type="spellStart"/>
+      <w:r>
+        <w:rPr>
+          <w:rFonts w:cstheme="minorHAnsi"/>
+        </w:rPr>
+        <w:t>Gemini</w:t>
+      </w:r>
+      <w:proofErr w:type="spellEnd"/>
+      <w:r>
+        <w:rPr>
+          <w:rFonts w:cstheme="minorHAnsi"/>
+        </w:rPr>
+        <w:t xml:space="preserve"> </w:t>
+      </w:r>
+      <w:proofErr w:type="spellStart"/>
+      <w:r>
+        <w:rPr>
+          <w:rFonts w:cstheme="minorHAnsi"/>
+        </w:rPr>
+        <w:t>said</w:t>
+      </w:r>
+      <w:proofErr w:type="spellEnd"/>
+      <w:r>
+        <w:rPr>
+          <w:rFonts w:cstheme="minorHAnsi"/>
+        </w:rPr>
+        <w:t xml:space="preserve"> La FAO es la Organización de las Naciones Unidas para la Alimentación y la Agricultura, cuyo fin es erradicar el hambre y mejorar la nutrición a nivel mundial. Por su parte, el CITES es un acuerdo internacional que regula el comercio de especies de animales y plantas silvestres para asegurar que esta actividad no ponga en peligro su supervivencia. Ambas instituciones trabajan para proteger recursos vitales, ya sea mediante la seguridad alimentaria o la conservación de la biodiversidad global.</w:t>
+      </w:r>
     </w:p>
     <w:p>
       <w:pPr>
@@ -775,6 +791,241 @@
         </w:rPr>
         <w:t>0</w:t>
       </w:r>
+    </w:p>
+    <w:p>
+      <w:pPr>
+        <w:pStyle w:val="whitespace-normal"/>
+        <w:rPr>
+          <w:rFonts w:cstheme="minorHAnsi"/>
+        </w:rPr>
+      </w:pPr>
+    </w:p>
+    <w:p>
+      <w:pPr>
+        <w:pStyle w:val="Ttulo2"/>
+      </w:pPr>
+      <w:r>
+        <w:lastRenderedPageBreak/>
+        <w:t>Casos prácticos</w:t>
+      </w:r>
+    </w:p>
+    <w:p/>
+    <w:p>
+      <w:pPr>
+        <w:pStyle w:val="Prrafodelista"/>
+        <w:numPr>
+          <w:ilvl w:val="0"/>
+          <w:numId w:val="1"/>
+        </w:numPr>
+      </w:pPr>
+      <w:r>
+        <w:t xml:space="preserve">2.1 Utilizando el siguiente enlace, realiza el cálculo de tu huella de carbono: </w:t>
+      </w:r>
+      <w:hyperlink r:id="rId5" w:history="1">
+        <w:r>
+          <w:rPr>
+            <w:rStyle w:val="Hipervnculo"/>
+          </w:rPr>
+          <w:t>https://www.fundacionaquae.org/calculadora-carbono/index.html</w:t>
+        </w:r>
+      </w:hyperlink>
+      <w:r>
+        <w:br/>
+        <w:t xml:space="preserve">Analiza el resultado y elabora un resumen con los datos obtenidos. Comentando de </w:t>
+      </w:r>
+      <w:proofErr w:type="spellStart"/>
+      <w:r>
+        <w:t>que</w:t>
+      </w:r>
+      <w:proofErr w:type="spellEnd"/>
+      <w:r>
+        <w:t xml:space="preserve"> modo y con </w:t>
+      </w:r>
+      <w:proofErr w:type="spellStart"/>
+      <w:r>
+        <w:t>que</w:t>
+      </w:r>
+      <w:proofErr w:type="spellEnd"/>
+      <w:r>
+        <w:t xml:space="preserve"> acción puedes reducir tu huella.</w:t>
+      </w:r>
+    </w:p>
+    <w:p>
+      <w:r>
+        <w:t>Mi huella de carbono es de 4.395,23 kg de CO2 anuales, una cifra que, aunque se sitúa por debajo de la media mundial de 5 toneladas, duplica el objetivo de sostenibilidad de 2 toneladas por persona. Este resultado evidencia la necesidad de ajustar mis hábitos de consumo, especialmente en transporte y energía. Para reducir este impacto, me comprometo a priorizar el transporte público, disminuir el consumo de carne y mejorar la eficiencia energética en mi hogar, alineando así mi estilo de vida con las metas climáticas globales.</w:t>
+      </w:r>
+    </w:p>
+    <w:p/>
+    <w:p>
+      <w:pPr>
+        <w:pStyle w:val="Prrafodelista"/>
+        <w:numPr>
+          <w:ilvl w:val="0"/>
+          <w:numId w:val="1"/>
+        </w:numPr>
+      </w:pPr>
+      <w:r>
+        <w:t xml:space="preserve">2.2 Debate en clase que </w:t>
+      </w:r>
+      <w:proofErr w:type="spellStart"/>
+      <w:r>
+        <w:t>habitos</w:t>
+      </w:r>
+      <w:proofErr w:type="spellEnd"/>
+      <w:r>
+        <w:t xml:space="preserve"> y no saludables y contribuyen a la sostenibilidad de la comunidad. Reflexiona a este respecto sobre el impacto de los viajes turísticos a países lejanos</w:t>
+      </w:r>
+    </w:p>
+    <w:p>
+      <w:pPr>
+        <w:pStyle w:val="Prrafodelista"/>
+        <w:rPr>
+          <w:rStyle w:val="Textoennegrita"/>
+          <w:rFonts w:eastAsiaTheme="majorEastAsia" w:cstheme="minorHAnsi"/>
+        </w:rPr>
+      </w:pPr>
+    </w:p>
+    <w:p>
+      <w:pPr>
+        <w:pStyle w:val="Prrafodelista"/>
+        <w:rPr>
+          <w:rFonts w:cstheme="minorHAnsi"/>
+          <w:b/>
+        </w:rPr>
+      </w:pPr>
+      <w:r>
+        <w:rPr>
+          <w:rStyle w:val="Textoennegrita"/>
+          <w:rFonts w:eastAsiaTheme="majorEastAsia" w:cstheme="minorHAnsi"/>
+        </w:rPr>
+        <w:t xml:space="preserve">· </w:t>
+      </w:r>
+      <w:r>
+        <w:rPr>
+          <w:rStyle w:val="Textoennegrita"/>
+          <w:rFonts w:eastAsiaTheme="majorEastAsia" w:cstheme="minorHAnsi"/>
+        </w:rPr>
+        <w:t>Hábitos saludables:</w:t>
+      </w:r>
+      <w:r>
+        <w:rPr>
+          <w:rFonts w:cstheme="minorHAnsi"/>
+        </w:rPr>
+        <w:t xml:space="preserve"> ahorrar agua y energía, reciclar, usar transporte público o </w:t>
+      </w:r>
+      <w:r>
+        <w:rPr>
+          <w:rStyle w:val="Textoennegrita"/>
+          <w:rFonts w:eastAsiaTheme="majorEastAsia" w:cstheme="minorHAnsi"/>
+          <w:b w:val="0"/>
+        </w:rPr>
+        <w:t>2</w:t>
+      </w:r>
+      <w:r>
+        <w:rPr>
+          <w:rStyle w:val="Textoennegrita"/>
+          <w:rFonts w:eastAsiaTheme="majorEastAsia" w:cstheme="minorHAnsi"/>
+        </w:rPr>
+        <w:t>.</w:t>
+      </w:r>
+      <w:r>
+        <w:rPr>
+          <w:rFonts w:cstheme="minorHAnsi"/>
+        </w:rPr>
+        <w:t>4 Investiga y explica la diferencia entre desertificación y desertización</w:t>
+      </w:r>
+    </w:p>
+    <w:p/>
+    <w:p>
+      <w:pPr>
+        <w:pStyle w:val="Prrafodelista"/>
+        <w:numPr>
+          <w:ilvl w:val="0"/>
+          <w:numId w:val="1"/>
+        </w:numPr>
+      </w:pPr>
+      <w:r>
+        <w:t xml:space="preserve">2.2 Debate en clase que </w:t>
+      </w:r>
+      <w:proofErr w:type="spellStart"/>
+      <w:r>
+        <w:t>habitos</w:t>
+      </w:r>
+      <w:proofErr w:type="spellEnd"/>
+      <w:r>
+        <w:t xml:space="preserve"> y no saludables y contribuyen a la sostenibilidad de la comunidad. Reflexiona a este respecto sobre el impacto de los viajes turísticos a países lejanos</w:t>
+      </w:r>
+    </w:p>
+    <w:p/>
+    <w:p>
+      <w:pPr>
+        <w:pStyle w:val="Prrafodelista"/>
+        <w:numPr>
+          <w:ilvl w:val="0"/>
+          <w:numId w:val="1"/>
+        </w:numPr>
+      </w:pPr>
+      <w:r>
+        <w:t xml:space="preserve">2.2 Debate en clase que </w:t>
+      </w:r>
+      <w:proofErr w:type="spellStart"/>
+      <w:r>
+        <w:t>habitos</w:t>
+      </w:r>
+      <w:proofErr w:type="spellEnd"/>
+      <w:r>
+        <w:t xml:space="preserve"> y no saludables y contribuyen a la sostenibilidad de la comunidad. Reflexiona a este respecto sobre el impacto de los viajes turísticos a países lejanos</w:t>
+      </w:r>
+    </w:p>
+    <w:p/>
+    <w:p>
+      <w:pPr>
+        <w:pStyle w:val="Prrafodelista"/>
+        <w:numPr>
+          <w:ilvl w:val="0"/>
+          <w:numId w:val="1"/>
+        </w:numPr>
+      </w:pPr>
+      <w:r>
+        <w:t xml:space="preserve">2.2 Debate en clase que </w:t>
+      </w:r>
+      <w:proofErr w:type="spellStart"/>
+      <w:r>
+        <w:t>habitos</w:t>
+      </w:r>
+      <w:proofErr w:type="spellEnd"/>
+      <w:r>
+        <w:t xml:space="preserve"> y no saludables y contribuyen a la sostenibilidad de la comunidad. Reflexiona a este respecto sobre el impacto de los viajes turísticos a países lejanos</w:t>
+      </w:r>
+    </w:p>
+    <w:p/>
+    <w:p>
+      <w:pPr>
+        <w:pStyle w:val="Prrafodelista"/>
+        <w:numPr>
+          <w:ilvl w:val="0"/>
+          <w:numId w:val="1"/>
+        </w:numPr>
+      </w:pPr>
+      <w:r>
+        <w:t xml:space="preserve">2.2 Debate en clase que </w:t>
+      </w:r>
+      <w:proofErr w:type="spellStart"/>
+      <w:r>
+        <w:t>habitos</w:t>
+      </w:r>
+      <w:proofErr w:type="spellEnd"/>
+      <w:r>
+        <w:t xml:space="preserve"> y no saludables y contribuyen a la sostenibilidad de la comunidad. Reflexiona a este respecto sobre el impacto de los viajes turísticos a países lejanos</w:t>
+      </w:r>
+    </w:p>
+    <w:p>
+      <w:pPr>
+        <w:pStyle w:val="whitespace-normal"/>
+        <w:rPr>
+          <w:rFonts w:cstheme="minorHAnsi"/>
+        </w:rPr>
+      </w:pPr>
     </w:p>
     <w:sectPr>
       <w:pgSz w:w="11906" w:h="16838"/>
@@ -1936,7 +2187,6 @@
     <w:name w:val="Hyperlink"/>
     <w:basedOn w:val="Fuentedeprrafopredeter"/>
     <w:uiPriority w:val="99"/>
-    <w:semiHidden/>
     <w:unhideWhenUsed/>
     <w:rsid w:val="00DD2F7D"/>
     <w:rPr>

</xml_diff>